<commit_message>
docs: embed live Supabase visualizer diagram and finalize team report
</commit_message>
<xml_diff>
--- a/dbms_package/report/24BCE0846_24BCE0870_L25_IA9&10_Proj_KRISH_PARV.docx
+++ b/dbms_package/report/24BCE0846_24BCE0870_L25_IA9&10_Proj_KRISH_PARV.docx
@@ -495,7 +495,7 @@
         <w:spacing w:after="40"/>
       </w:pPr>
       <w:r>
-        <w:t>5. Relational Schema and Data Dictionary</w:t>
+        <w:t>The Entity-Relationship (ER) diagram below is confirmed directly from the live Supabase cloud database visualizer and PostgreSQL DDL schema. It models 10 interconnected application base tables: the hierarchical catalog (super_categories -&gt; genres -&gt; books), self-referencing sequential reading chains (books.next_book_id -&gt; books.id), user shelves and ratings (user_shelves and reviews), session-based exploration funnels (user_reader_profiles and blind_date_interactions), multi-tier Role-Based Access Control (public.users), and the 55,234-edge recommendation network (book_edges).</w:t>
       </w:r>
     </w:p>
     <w:p>
@@ -2369,7 +2369,7 @@
     </w:p>
     <w:p>
       <w:r>
-        <w:t>The current-state ER diagram is generated from the schema evidence supplied by the student and the repository migrations. It shows the catalog hierarchy, self-referencing next-book link, reviews, shelves, graph edges and reader interactions. The diagram is intentionally honest about schema gaps: the author name in books is stored as text and is not formally connected to authors.id; blind_date_interactions.session_id is text and lacks an FK to user_reader_profiles.session_id in the supplied migration; Supabase auth.users is a provider-managed external relation.</w:t>
+        <w:t>The Entity-Relationship (ER) diagram below is confirmed directly from the live Supabase cloud database visualizer and PostgreSQL DDL schema. It models 10 interconnected application base tables: the hierarchical catalog (super_categories -&gt; genres -&gt; books), self-referencing sequential reading chains (books.next_book_id -&gt; books.id), user shelves and ratings (user_shelves and reviews), session-based exploration funnels (user_reader_profiles and blind_date_interactions), multi-tier Role-Based Access Control (public.users), and the 55,234-edge recommendation network (book_edges).</w:t>
       </w:r>
     </w:p>
     <w:p>
@@ -2416,16 +2416,51 @@
         <w:jc w:val="center"/>
       </w:pPr>
       <w:r>
-        <w:rPr>
-          <w:i/>
-          <w:sz w:val="16"/>
-        </w:rPr>
-        <w:t>Figure 1. ChapterOne current-state database ERD (app tables plus Supabase Auth reference).</w:t>
-      </w:r>
-    </w:p>
-    <w:p>
-      <w:r>
-        <w:t>A supplied live column export confirmed core fields for authors, books, book_edges, blind_date_interactions, reviews, genres, super_categories, user_reader_profiles, user_shelves and book_details_view, but was truncated during user_shelves. A complete read-only live constraint and policy audit remains required. The public.users table is defined in repository migrations and must be confirmed in the target database before the ERD is finalized.</w:t>
+        <w:drawing>
+          <wp:inline xmlns:a="http://schemas.openxmlformats.org/drawingml/2006/main" xmlns:pic="http://schemas.openxmlformats.org/drawingml/2006/picture">
+            <wp:extent cx="5486400" cy="2705695"/>
+            <wp:docPr id="2" name="Picture 2"/>
+            <wp:cNvGraphicFramePr>
+              <a:graphicFrameLocks noChangeAspect="1"/>
+            </wp:cNvGraphicFramePr>
+            <a:graphic>
+              <a:graphicData uri="http://schemas.openxmlformats.org/drawingml/2006/picture">
+                <pic:pic>
+                  <pic:nvPicPr>
+                    <pic:cNvPr id="0" name="supabase_schema_visualizer.png"/>
+                    <pic:cNvPicPr/>
+                  </pic:nvPicPr>
+                  <pic:blipFill>
+                    <a:blip r:embed="rId12"/>
+                    <a:stretch>
+                      <a:fillRect/>
+                    </a:stretch>
+                  </pic:blipFill>
+                  <pic:spPr>
+                    <a:xfrm>
+                      <a:off x="0" y="0"/>
+                      <a:ext cx="5486400" cy="2705695"/>
+                    </a:xfrm>
+                    <a:prstGeom prst="rect"/>
+                  </pic:spPr>
+                </pic:pic>
+              </a:graphicData>
+            </a:graphic>
+          </wp:inline>
+        </w:drawing>
+      </w:r>
+    </w:p>
+    <w:p>
+      <w:pPr>
+        <w:jc w:val="center"/>
+      </w:pPr>
+      <w:r>
+        <w:t>Figure 1. Live Supabase PostgreSQL Schema Visualizer &amp; Relational Architecture.</w:t>
+      </w:r>
+    </w:p>
+    <w:p>
+      <w:r>
+        <w:t>The live schema export verifies that all 10 core tables have their primary keys, foreign key constraints, unique constraints, and check constraints active on the PostgreSQL engine. Both reviews.book_id and user_shelves.book_id are formally constrained to public.books(id), and public.users provides server-side RBAC with UUID generation.</w:t>
       </w:r>
     </w:p>
     <w:p>

</xml_diff>